<commit_message>
tc-final: calibrate discretion to industry practice
After auditing the competitors' actual wording, turn the operator-protection
dial up to match the peer set (all use sole/absolute discretion):
- Sole/absolute discretion on fraud, abuse, bonus eligibility, account closure
- Add close-without-stated-reason (Betpanda/Coins verbatim), non-exhaustive
  abuse catch-all (all peers), and set-off/clawback (Coins)
- Deposit refund for NON-fraud voids kept but made discretionary ("we may")
  — mirrors Betpanda/Coins, doubles as chargeback armor; full forfeiture incl.
  deposit retained for genuine fraud/AML
- Drop the loud green "Fairness limit" highlight boxes so protections read as
  normal terms (less obvious), not spotlit
Still avoids dispute-magnet traps: no retroactive voiding, no whole-balance
grab on clean voluntary closure, soft dormancy. Regenerated HTML + .docx.

Co-Authored-By: claude-flow <ruv@ruv.net>
</commit_message>
<xml_diff>
--- a/goluna-demo/GoLuna-Terms-and-Conditions.docx
+++ b/goluna-demo/GoLuna-Terms-and-Conditions.docx
@@ -603,7 +603,7 @@
           <w:sz w:val="20"/>
           <w:szCs w:val="20"/>
         </w:rPr>
-        <w:t xml:space="preserve">Pending verification, we may suspend withdrawals and restrict the account. If verification is not completed within a reasonable period, or is not passed, we may close the account; and where there are reasonable grounds to suspect fraud or an AML breach, we may withhold funds to the extent and for the period required by law.</w:t>
+        <w:t xml:space="preserve">Pending verification, we may suspend withdrawals and restrict the account. If verification is not completed within a reasonable period, or is not passed, we may suspend or close the account at our sole discretion; and where there are reasonable grounds to suspect fraud or an AML breach, we may withhold funds to the extent and for the period required by law.</w:t>
       </w:r>
     </w:p>
     <w:p>
@@ -1578,7 +1578,7 @@
           <w:sz w:val="20"/>
           <w:szCs w:val="20"/>
         </w:rPr>
-        <w:t xml:space="preserve">Each promotion may carry its own specific terms, which prevail over this Section for that promotion. We may amend, suspend or withdraw any promotion prospectively. In a bonus dispute, our determination, made reasonably and in good faith, is final.</w:t>
+        <w:t xml:space="preserve">Each promotion may carry its own specific terms, which prevail over this Section for that promotion. We may amend, suspend or withdraw any promotion, and we may determine eligibility and any bonus-abuse question, at our sole discretion. We may exclude any player from any promotion, bonus or offer at our sole discretion. In a bonus dispute our determination is final.</w:t>
       </w:r>
     </w:p>
     <w:p>
@@ -2012,6 +2012,37 @@
     </w:p>
     <w:p>
       <w:pPr>
+        <w:spacing w:after="70"/>
+      </w:pPr>
+      <w:r>
+        <w:rPr>
+          <w:b/>
+          <w:bCs/>
+          <w:color w:val="333333"/>
+          <w:sz w:val="20"/>
+          <w:szCs w:val="20"/>
+        </w:rPr>
+        <w:t xml:space="preserve">12.8  </w:t>
+      </w:r>
+      <w:r>
+        <w:rPr>
+          <w:b/>
+          <w:bCs/>
+          <w:sz w:val="20"/>
+          <w:szCs w:val="20"/>
+        </w:rPr>
+        <w:t xml:space="preserve">Non-exhaustive. </w:t>
+      </w:r>
+      <w:r>
+        <w:rPr>
+          <w:sz w:val="20"/>
+          <w:szCs w:val="20"/>
+        </w:rPr>
+        <w:t xml:space="preserve">This list is not exhaustive. We may treat as a breach any other activity that we consider, at our sole discretion, to be exploitative, collusive, abusive, or otherwise damaging to the Company, its games, its promotions or other players.</w:t>
+      </w:r>
+    </w:p>
+    <w:p>
+      <w:pPr>
         <w:pStyle w:val="Heading1"/>
         <w:spacing w:before="220" w:after="60"/>
       </w:pPr>
@@ -2084,7 +2115,7 @@
           <w:sz w:val="20"/>
           <w:szCs w:val="20"/>
         </w:rPr>
-        <w:t xml:space="preserve">On detection of, or reasonable grounds to suspect, a breach of Sections 3, 4 or 12, we may, acting reasonably and proportionately: suspend or close the affected account(s); withhold, suspend or reverse withdrawals; void bets, bonuses and winnings derived from the breaching conduct; and reclaim amounts paid in error.</w:t>
+        <w:t xml:space="preserve">On detection of, or reasonable grounds to suspect, a breach of Sections 3, 4 or 12, we may, at our sole and absolute discretion: suspend or close the affected account(s); withhold, suspend or reverse withdrawals; void bets, bonuses and winnings derived from the breaching conduct; and reclaim amounts paid in error.</w:t>
       </w:r>
     </w:p>
     <w:p>
@@ -2130,14 +2161,14 @@
           <w:sz w:val="20"/>
           <w:szCs w:val="20"/>
         </w:rPr>
-        <w:t xml:space="preserve">Fairness limit. </w:t>
-      </w:r>
-      <w:r>
-        <w:rPr>
-          <w:sz w:val="20"/>
-          <w:szCs w:val="20"/>
-        </w:rPr>
-        <w:t xml:space="preserve">In the absence of fraud, money laundering or prohibited conduct, where a bonus or promotion is voided we will still refund a player's verified, lawfully-deposited and unwagered funds. We void winnings derived from a breach — we do not confiscate a player's own clean deposit as a matter of course.</w:t>
+        <w:t xml:space="preserve">Deposit treatment. </w:t>
+      </w:r>
+      <w:r>
+        <w:rPr>
+          <w:sz w:val="20"/>
+          <w:szCs w:val="20"/>
+        </w:rPr>
+        <w:t xml:space="preserve">Where we void a bonus or promotion for a non-fraudulent breach, we void the winnings derived from it and may, at our sole discretion, return the player's verified, lawfully-deposited and unwagered funds. Where the breach involves fraud, money laundering or prohibited conduct under Section 12, the entire balance, including deposits, may be withheld and forfeited to the extent permitted by law.</w:t>
       </w:r>
     </w:p>
     <w:p>
@@ -2156,10 +2187,41 @@
       </w:r>
       <w:r>
         <w:rPr>
-          <w:sz w:val="20"/>
-          <w:szCs w:val="20"/>
-        </w:rPr>
-        <w:t xml:space="preserve">Returns, winnings or bonuses connected to a duplicate or linked account may be reclaimed. Our determinations under this Section are made in good faith and are subject to the complaints process in Section 21.</w:t>
+          <w:b/>
+          <w:bCs/>
+          <w:sz w:val="20"/>
+          <w:szCs w:val="20"/>
+        </w:rPr>
+        <w:t xml:space="preserve">Set-off and clawback. </w:t>
+      </w:r>
+      <w:r>
+        <w:rPr>
+          <w:sz w:val="20"/>
+          <w:szCs w:val="20"/>
+        </w:rPr>
+        <w:t xml:space="preserve">We may set off against any balance in your account any amount you owe us, including funds credited in error, reversed or charged-back deposits, clawed-back bonuses and applicable fees. Amounts credited to you in error remain our property; if you have already withdrawn them, they constitute a debt due to us which you agree to repay on demand.</w:t>
+      </w:r>
+    </w:p>
+    <w:p>
+      <w:pPr>
+        <w:spacing w:after="70"/>
+      </w:pPr>
+      <w:r>
+        <w:rPr>
+          <w:b/>
+          <w:bCs/>
+          <w:color w:val="333333"/>
+          <w:sz w:val="20"/>
+          <w:szCs w:val="20"/>
+        </w:rPr>
+        <w:t xml:space="preserve">13.6  </w:t>
+      </w:r>
+      <w:r>
+        <w:rPr>
+          <w:sz w:val="20"/>
+          <w:szCs w:val="20"/>
+        </w:rPr>
+        <w:t xml:space="preserve">Returns, winnings or bonuses connected to a duplicate or linked account may be reclaimed. We exercise the rights in this Section at our discretion; you may raise a complaint under Section 21.</w:t>
       </w:r>
     </w:p>
     <w:p>
@@ -2227,7 +2289,7 @@
           <w:sz w:val="20"/>
           <w:szCs w:val="20"/>
         </w:rPr>
-        <w:t xml:space="preserve">We may suspend or terminate access, acting reasonably, including for breach of these Terms, legal or regulatory reasons, or unacceptable risk.</w:t>
+        <w:t xml:space="preserve">We may decline to open, suspend, or close any account at our sole and absolute discretion, including for breach of these Terms, legal or regulatory reasons, or unacceptable risk, and — subject to applicable law — without obligation to state a reason or give prior notice.</w:t>
       </w:r>
     </w:p>
     <w:p>
@@ -2289,7 +2351,7 @@
           <w:sz w:val="20"/>
           <w:szCs w:val="20"/>
         </w:rPr>
-        <w:t xml:space="preserve">If you close your account voluntarily, you forfeit only unredeemed cashback, rakeback or bonus that has not met its conditions. Your genuine, withdrawable cash balance is paid out to you — we do not confiscate it on closure.</w:t>
+        <w:t xml:space="preserve">If you close your account voluntarily and there is no open breach or investigation, we return your verified withdrawable cash balance, subject to Sections 4, 7 and 13 (including any set-off). Unredeemed cashback, rakeback or bonus that has not met its conditions is forfeited.</w:t>
       </w:r>
     </w:p>
     <w:p>

</xml_diff>

<commit_message>
tc-final: add grouped TL;DR summary at the bottom
8 category cards (Who can play, Deposits & withdrawals, Bet & win limits,
Bonuses, KYC/AML, Fair play & our rights, Responsible gambling, Legal &
changes), color-coded to match section tags, plain-language bullets.
Marked non-binding (full terms govern). Renders in both HTML (2-col grid,
single column on mobile) and the .docx (heading + grouped bullets).

Co-Authored-By: claude-flow <ruv@ruv.net>
</commit_message>
<xml_diff>
--- a/goluna-demo/GoLuna-Terms-and-Conditions.docx
+++ b/goluna-demo/GoLuna-Terms-and-Conditions.docx
@@ -3400,6 +3400,626 @@
           <w:szCs w:val="20"/>
         </w:rPr>
         <w:t xml:space="preserve">Website: [goluna domain — to confirm]. Support and complaints: [support@ — to confirm]. Effective date: [effective date — to confirm].</w:t>
+      </w:r>
+    </w:p>
+    <w:p>
+      <w:pPr>
+        <w:pStyle w:val="Heading1"/>
+        <w:spacing w:before="260" w:after="50"/>
+      </w:pPr>
+      <w:r>
+        <w:t xml:space="preserve">Summary — Key Points (TL;DR)</w:t>
+      </w:r>
+    </w:p>
+    <w:p>
+      <w:pPr>
+        <w:spacing w:after="120"/>
+      </w:pPr>
+      <w:r>
+        <w:rPr>
+          <w:i/>
+          <w:iCs/>
+          <w:color w:val="6B7280"/>
+          <w:sz w:val="18"/>
+          <w:szCs w:val="18"/>
+        </w:rPr>
+        <w:t xml:space="preserve">Plain-language summary of the points that matter most. For convenience only and not legally binding; the full Terms above govern.</w:t>
+      </w:r>
+    </w:p>
+    <w:p>
+      <w:pPr>
+        <w:spacing w:before="120" w:after="40"/>
+      </w:pPr>
+      <w:r>
+        <w:rPr>
+          <w:b/>
+          <w:bCs/>
+          <w:color w:val="0B5394"/>
+          <w:sz w:val="20"/>
+          <w:szCs w:val="20"/>
+        </w:rPr>
+        <w:t xml:space="preserve">Who can play</w:t>
+      </w:r>
+    </w:p>
+    <w:p>
+      <w:pPr>
+        <w:pStyle w:val="ListParagraph"/>
+        <w:numPr>
+          <w:ilvl w:val="0"/>
+          <w:numId w:val="1"/>
+        </w:numPr>
+        <w:spacing w:after="30"/>
+      </w:pPr>
+      <w:r>
+        <w:rPr>
+          <w:sz w:val="19"/>
+          <w:szCs w:val="19"/>
+        </w:rPr>
+        <w:t xml:space="preserve">You must be 18+ (or older if your country requires) and legally allowed to gamble.</w:t>
+      </w:r>
+    </w:p>
+    <w:p>
+      <w:pPr>
+        <w:pStyle w:val="ListParagraph"/>
+        <w:numPr>
+          <w:ilvl w:val="0"/>
+          <w:numId w:val="1"/>
+        </w:numPr>
+        <w:spacing w:after="30"/>
+      </w:pPr>
+      <w:r>
+        <w:rPr>
+          <w:sz w:val="19"/>
+          <w:szCs w:val="19"/>
+        </w:rPr>
+        <w:t xml:space="preserve">One account per person, household, IP address, device and payment method.</w:t>
+      </w:r>
+    </w:p>
+    <w:p>
+      <w:pPr>
+        <w:pStyle w:val="ListParagraph"/>
+        <w:numPr>
+          <w:ilvl w:val="0"/>
+          <w:numId w:val="1"/>
+        </w:numPr>
+        <w:spacing w:after="30"/>
+      </w:pPr>
+      <w:r>
+        <w:rPr>
+          <w:sz w:val="19"/>
+          <w:szCs w:val="19"/>
+        </w:rPr>
+        <w:t xml:space="preserve">Blocked from: USA, UK, Costa Rica, France, Netherlands &amp; Dutch Caribbean, Spain, Australia, and sanctioned countries.</w:t>
+      </w:r>
+    </w:p>
+    <w:p>
+      <w:pPr>
+        <w:pStyle w:val="ListParagraph"/>
+        <w:numPr>
+          <w:ilvl w:val="0"/>
+          <w:numId w:val="1"/>
+        </w:numPr>
+        <w:spacing w:after="30"/>
+      </w:pPr>
+      <w:r>
+        <w:rPr>
+          <w:sz w:val="19"/>
+          <w:szCs w:val="19"/>
+        </w:rPr>
+        <w:t xml:space="preserve">Give accurate details and keep them current.</w:t>
+      </w:r>
+    </w:p>
+    <w:p>
+      <w:pPr>
+        <w:spacing w:before="120" w:after="40"/>
+      </w:pPr>
+      <w:r>
+        <w:rPr>
+          <w:b/>
+          <w:bCs/>
+          <w:color w:val="0B5394"/>
+          <w:sz w:val="20"/>
+          <w:szCs w:val="20"/>
+        </w:rPr>
+        <w:t xml:space="preserve">Deposits &amp; withdrawals</w:t>
+      </w:r>
+    </w:p>
+    <w:p>
+      <w:pPr>
+        <w:pStyle w:val="ListParagraph"/>
+        <w:numPr>
+          <w:ilvl w:val="0"/>
+          <w:numId w:val="1"/>
+        </w:numPr>
+        <w:spacing w:after="30"/>
+      </w:pPr>
+      <w:r>
+        <w:rPr>
+          <w:sz w:val="19"/>
+          <w:szCs w:val="19"/>
+        </w:rPr>
+        <w:t xml:space="preserve">Crypto only — you withdraw in the same coin you deposited; no currency exchange.</w:t>
+      </w:r>
+    </w:p>
+    <w:p>
+      <w:pPr>
+        <w:pStyle w:val="ListParagraph"/>
+        <w:numPr>
+          <w:ilvl w:val="0"/>
+          <w:numId w:val="1"/>
+        </w:numPr>
+        <w:spacing w:after="30"/>
+      </w:pPr>
+      <w:r>
+        <w:rPr>
+          <w:sz w:val="19"/>
+          <w:szCs w:val="19"/>
+        </w:rPr>
+        <w:t xml:space="preserve">Send to the correct address and network: wrong sends cannot be recovered.</w:t>
+      </w:r>
+    </w:p>
+    <w:p>
+      <w:pPr>
+        <w:pStyle w:val="ListParagraph"/>
+        <w:numPr>
+          <w:ilvl w:val="0"/>
+          <w:numId w:val="1"/>
+        </w:numPr>
+        <w:spacing w:after="30"/>
+      </w:pPr>
+      <w:r>
+        <w:rPr>
+          <w:sz w:val="19"/>
+          <w:szCs w:val="19"/>
+        </w:rPr>
+        <w:t xml:space="preserve">Deposits must be wagered once (1x) before you can withdraw.</w:t>
+      </w:r>
+    </w:p>
+    <w:p>
+      <w:pPr>
+        <w:pStyle w:val="ListParagraph"/>
+        <w:numPr>
+          <w:ilvl w:val="0"/>
+          <w:numId w:val="1"/>
+        </w:numPr>
+        <w:spacing w:after="30"/>
+      </w:pPr>
+      <w:r>
+        <w:rPr>
+          <w:sz w:val="19"/>
+          <w:szCs w:val="19"/>
+        </w:rPr>
+        <w:t xml:space="preserve">Withdrawal limits: $5,000 / 24h, $15,000 / week, $45,000 / month (higher for VIPs).</w:t>
+      </w:r>
+    </w:p>
+    <w:p>
+      <w:pPr>
+        <w:pStyle w:val="ListParagraph"/>
+        <w:numPr>
+          <w:ilvl w:val="0"/>
+          <w:numId w:val="1"/>
+        </w:numPr>
+        <w:spacing w:after="30"/>
+      </w:pPr>
+      <w:r>
+        <w:rPr>
+          <w:sz w:val="19"/>
+          <w:szCs w:val="19"/>
+        </w:rPr>
+        <w:t xml:space="preserve">No interest is paid — GoLuna is not a bank.</w:t>
+      </w:r>
+    </w:p>
+    <w:p>
+      <w:pPr>
+        <w:spacing w:before="120" w:after="40"/>
+      </w:pPr>
+      <w:r>
+        <w:rPr>
+          <w:b/>
+          <w:bCs/>
+          <w:color w:val="0B5394"/>
+          <w:sz w:val="20"/>
+          <w:szCs w:val="20"/>
+        </w:rPr>
+        <w:t xml:space="preserve">Bet &amp; win limits</w:t>
+      </w:r>
+    </w:p>
+    <w:p>
+      <w:pPr>
+        <w:pStyle w:val="ListParagraph"/>
+        <w:numPr>
+          <w:ilvl w:val="0"/>
+          <w:numId w:val="1"/>
+        </w:numPr>
+        <w:spacing w:after="30"/>
+      </w:pPr>
+      <w:r>
+        <w:rPr>
+          <w:sz w:val="19"/>
+          <w:szCs w:val="19"/>
+        </w:rPr>
+        <w:t xml:space="preserve">Maximum bet: EUR 1,000 per round.</w:t>
+      </w:r>
+    </w:p>
+    <w:p>
+      <w:pPr>
+        <w:pStyle w:val="ListParagraph"/>
+        <w:numPr>
+          <w:ilvl w:val="0"/>
+          <w:numId w:val="1"/>
+        </w:numPr>
+        <w:spacing w:after="30"/>
+      </w:pPr>
+      <w:r>
+        <w:rPr>
+          <w:sz w:val="19"/>
+          <w:szCs w:val="19"/>
+        </w:rPr>
+        <w:t xml:space="preserve">Maximum win: EUR 50,000 per round and 3 BTC per 24 hours.</w:t>
+      </w:r>
+    </w:p>
+    <w:p>
+      <w:pPr>
+        <w:pStyle w:val="ListParagraph"/>
+        <w:numPr>
+          <w:ilvl w:val="0"/>
+          <w:numId w:val="1"/>
+        </w:numPr>
+        <w:spacing w:after="30"/>
+      </w:pPr>
+      <w:r>
+        <w:rPr>
+          <w:sz w:val="19"/>
+          <w:szCs w:val="19"/>
+        </w:rPr>
+        <w:t xml:space="preserve">Anything above a cap is not paid out.</w:t>
+      </w:r>
+    </w:p>
+    <w:p>
+      <w:pPr>
+        <w:spacing w:before="120" w:after="40"/>
+      </w:pPr>
+      <w:r>
+        <w:rPr>
+          <w:b/>
+          <w:bCs/>
+          <w:color w:val="0B5394"/>
+          <w:sz w:val="20"/>
+          <w:szCs w:val="20"/>
+        </w:rPr>
+        <w:t xml:space="preserve">Bonuses</w:t>
+      </w:r>
+    </w:p>
+    <w:p>
+      <w:pPr>
+        <w:pStyle w:val="ListParagraph"/>
+        <w:numPr>
+          <w:ilvl w:val="0"/>
+          <w:numId w:val="1"/>
+        </w:numPr>
+        <w:spacing w:after="30"/>
+      </w:pPr>
+      <w:r>
+        <w:rPr>
+          <w:sz w:val="19"/>
+          <w:szCs w:val="19"/>
+        </w:rPr>
+        <w:t xml:space="preserve">Standard model is cashback: 1x wagering, weekly cap, not on sports.</w:t>
+      </w:r>
+    </w:p>
+    <w:p>
+      <w:pPr>
+        <w:pStyle w:val="ListParagraph"/>
+        <w:numPr>
+          <w:ilvl w:val="0"/>
+          <w:numId w:val="1"/>
+        </w:numPr>
+        <w:spacing w:after="30"/>
+      </w:pPr>
+      <w:r>
+        <w:rPr>
+          <w:sz w:val="19"/>
+          <w:szCs w:val="19"/>
+        </w:rPr>
+        <w:t xml:space="preserve">Deposit-match bonuses are reserved — not active yet.</w:t>
+      </w:r>
+    </w:p>
+    <w:p>
+      <w:pPr>
+        <w:pStyle w:val="ListParagraph"/>
+        <w:numPr>
+          <w:ilvl w:val="0"/>
+          <w:numId w:val="1"/>
+        </w:numPr>
+        <w:spacing w:after="30"/>
+      </w:pPr>
+      <w:r>
+        <w:rPr>
+          <w:sz w:val="19"/>
+          <w:szCs w:val="19"/>
+        </w:rPr>
+        <w:t xml:space="preserve">If match bonuses launch: 35x wagering, $5 max bet while active, 30-day limit, winnings capped at the bonus amount.</w:t>
+      </w:r>
+    </w:p>
+    <w:p>
+      <w:pPr>
+        <w:pStyle w:val="ListParagraph"/>
+        <w:numPr>
+          <w:ilvl w:val="0"/>
+          <w:numId w:val="1"/>
+        </w:numPr>
+        <w:spacing w:after="30"/>
+      </w:pPr>
+      <w:r>
+        <w:rPr>
+          <w:sz w:val="19"/>
+          <w:szCs w:val="19"/>
+        </w:rPr>
+        <w:t xml:space="preserve">Withdrawing cash while a bonus is active forfeits that bonus. One bonus per person/household/IP/device.</w:t>
+      </w:r>
+    </w:p>
+    <w:p>
+      <w:pPr>
+        <w:spacing w:before="120" w:after="40"/>
+      </w:pPr>
+      <w:r>
+        <w:rPr>
+          <w:b/>
+          <w:bCs/>
+          <w:color w:val="0B5394"/>
+          <w:sz w:val="20"/>
+          <w:szCs w:val="20"/>
+        </w:rPr>
+        <w:t xml:space="preserve">Verification (KYC / AML)</w:t>
+      </w:r>
+    </w:p>
+    <w:p>
+      <w:pPr>
+        <w:pStyle w:val="ListParagraph"/>
+        <w:numPr>
+          <w:ilvl w:val="0"/>
+          <w:numId w:val="1"/>
+        </w:numPr>
+        <w:spacing w:after="30"/>
+      </w:pPr>
+      <w:r>
+        <w:rPr>
+          <w:sz w:val="19"/>
+          <w:szCs w:val="19"/>
+        </w:rPr>
+        <w:t xml:space="preserve">No ID needed to sign up.</w:t>
+      </w:r>
+    </w:p>
+    <w:p>
+      <w:pPr>
+        <w:pStyle w:val="ListParagraph"/>
+        <w:numPr>
+          <w:ilvl w:val="0"/>
+          <w:numId w:val="1"/>
+        </w:numPr>
+        <w:spacing w:after="30"/>
+      </w:pPr>
+      <w:r>
+        <w:rPr>
+          <w:sz w:val="19"/>
+          <w:szCs w:val="19"/>
+        </w:rPr>
+        <w:t xml:space="preserve">We can request ID, address and source of funds — especially before a withdrawal, over certain amounts, or on suspicion.</w:t>
+      </w:r>
+    </w:p>
+    <w:p>
+      <w:pPr>
+        <w:pStyle w:val="ListParagraph"/>
+        <w:numPr>
+          <w:ilvl w:val="0"/>
+          <w:numId w:val="1"/>
+        </w:numPr>
+        <w:spacing w:after="30"/>
+      </w:pPr>
+      <w:r>
+        <w:rPr>
+          <w:sz w:val="19"/>
+          <w:szCs w:val="19"/>
+        </w:rPr>
+        <w:t xml:space="preserve">We can pause withdrawals and the account until you verify.</w:t>
+      </w:r>
+    </w:p>
+    <w:p>
+      <w:pPr>
+        <w:spacing w:before="120" w:after="40"/>
+      </w:pPr>
+      <w:r>
+        <w:rPr>
+          <w:b/>
+          <w:bCs/>
+          <w:color w:val="0B5394"/>
+          <w:sz w:val="20"/>
+          <w:szCs w:val="20"/>
+        </w:rPr>
+        <w:t xml:space="preserve">Fair play &amp; our rights</w:t>
+      </w:r>
+    </w:p>
+    <w:p>
+      <w:pPr>
+        <w:pStyle w:val="ListParagraph"/>
+        <w:numPr>
+          <w:ilvl w:val="0"/>
+          <w:numId w:val="1"/>
+        </w:numPr>
+        <w:spacing w:after="30"/>
+      </w:pPr>
+      <w:r>
+        <w:rPr>
+          <w:sz w:val="19"/>
+          <w:szCs w:val="19"/>
+        </w:rPr>
+        <w:t xml:space="preserve">Banned: bots, multiple accounts, collusion, bonus abuse and exploiting bugs.</w:t>
+      </w:r>
+    </w:p>
+    <w:p>
+      <w:pPr>
+        <w:pStyle w:val="ListParagraph"/>
+        <w:numPr>
+          <w:ilvl w:val="0"/>
+          <w:numId w:val="1"/>
+        </w:numPr>
+        <w:spacing w:after="30"/>
+      </w:pPr>
+      <w:r>
+        <w:rPr>
+          <w:sz w:val="19"/>
+          <w:szCs w:val="19"/>
+        </w:rPr>
+        <w:t xml:space="preserve">For fraud or abuse we can suspend or close accounts, void winnings and forfeit balances — at our sole discretion.</w:t>
+      </w:r>
+    </w:p>
+    <w:p>
+      <w:pPr>
+        <w:pStyle w:val="ListParagraph"/>
+        <w:numPr>
+          <w:ilvl w:val="0"/>
+          <w:numId w:val="1"/>
+        </w:numPr>
+        <w:spacing w:after="30"/>
+      </w:pPr>
+      <w:r>
+        <w:rPr>
+          <w:sz w:val="19"/>
+          <w:szCs w:val="19"/>
+        </w:rPr>
+        <w:t xml:space="preserve">For non-fraud bonus issues we void the winnings but may refund your clean deposit.</w:t>
+      </w:r>
+    </w:p>
+    <w:p>
+      <w:pPr>
+        <w:pStyle w:val="ListParagraph"/>
+        <w:numPr>
+          <w:ilvl w:val="0"/>
+          <w:numId w:val="1"/>
+        </w:numPr>
+        <w:spacing w:after="30"/>
+      </w:pPr>
+      <w:r>
+        <w:rPr>
+          <w:sz w:val="19"/>
+          <w:szCs w:val="19"/>
+        </w:rPr>
+        <w:t xml:space="preserve">We can close an account without giving a reason (subject to law) and deduct what you owe us from your balance.</w:t>
+      </w:r>
+    </w:p>
+    <w:p>
+      <w:pPr>
+        <w:spacing w:before="120" w:after="40"/>
+      </w:pPr>
+      <w:r>
+        <w:rPr>
+          <w:b/>
+          <w:bCs/>
+          <w:color w:val="0B5394"/>
+          <w:sz w:val="20"/>
+          <w:szCs w:val="20"/>
+        </w:rPr>
+        <w:t xml:space="preserve">Responsible gambling</w:t>
+      </w:r>
+    </w:p>
+    <w:p>
+      <w:pPr>
+        <w:pStyle w:val="ListParagraph"/>
+        <w:numPr>
+          <w:ilvl w:val="0"/>
+          <w:numId w:val="1"/>
+        </w:numPr>
+        <w:spacing w:after="30"/>
+      </w:pPr>
+      <w:r>
+        <w:rPr>
+          <w:sz w:val="19"/>
+          <w:szCs w:val="19"/>
+        </w:rPr>
+        <w:t xml:space="preserve">Deposit, loss and session limits, cool-off and self-exclusion are available on request.</w:t>
+      </w:r>
+    </w:p>
+    <w:p>
+      <w:pPr>
+        <w:pStyle w:val="ListParagraph"/>
+        <w:numPr>
+          <w:ilvl w:val="0"/>
+          <w:numId w:val="1"/>
+        </w:numPr>
+        <w:spacing w:after="30"/>
+      </w:pPr>
+      <w:r>
+        <w:rPr>
+          <w:sz w:val="19"/>
+          <w:szCs w:val="19"/>
+        </w:rPr>
+        <w:t xml:space="preserve">Play for entertainment and within your means; help-organisation links are provided.</w:t>
+      </w:r>
+    </w:p>
+    <w:p>
+      <w:pPr>
+        <w:spacing w:before="120" w:after="40"/>
+      </w:pPr>
+      <w:r>
+        <w:rPr>
+          <w:b/>
+          <w:bCs/>
+          <w:color w:val="0B5394"/>
+          <w:sz w:val="20"/>
+          <w:szCs w:val="20"/>
+        </w:rPr>
+        <w:t xml:space="preserve">Legal &amp; changes</w:t>
+      </w:r>
+    </w:p>
+    <w:p>
+      <w:pPr>
+        <w:pStyle w:val="ListParagraph"/>
+        <w:numPr>
+          <w:ilvl w:val="0"/>
+          <w:numId w:val="1"/>
+        </w:numPr>
+        <w:spacing w:after="30"/>
+      </w:pPr>
+      <w:r>
+        <w:rPr>
+          <w:sz w:val="19"/>
+          <w:szCs w:val="19"/>
+        </w:rPr>
+        <w:t xml:space="preserve">Governed by the laws of Costa Rica; there is no external gambling regulator, so our decision is final.</w:t>
+      </w:r>
+    </w:p>
+    <w:p>
+      <w:pPr>
+        <w:pStyle w:val="ListParagraph"/>
+        <w:numPr>
+          <w:ilvl w:val="0"/>
+          <w:numId w:val="1"/>
+        </w:numPr>
+        <w:spacing w:after="30"/>
+      </w:pPr>
+      <w:r>
+        <w:rPr>
+          <w:sz w:val="19"/>
+          <w:szCs w:val="19"/>
+        </w:rPr>
+        <w:t xml:space="preserve">We can update these terms; changes apply going forward, not to play already completed.</w:t>
+      </w:r>
+    </w:p>
+    <w:p>
+      <w:pPr>
+        <w:pStyle w:val="ListParagraph"/>
+        <w:numPr>
+          <w:ilvl w:val="0"/>
+          <w:numId w:val="1"/>
+        </w:numPr>
+        <w:spacing w:after="30"/>
+      </w:pPr>
+      <w:r>
+        <w:rPr>
+          <w:sz w:val="19"/>
+          <w:szCs w:val="19"/>
+        </w:rPr>
+        <w:t xml:space="preserve">Dormant after 12 months — reactivate free anytime; a small fee applies only after notice.</w:t>
       </w:r>
     </w:p>
     <w:p>

</xml_diff>

<commit_message>
tc-final: add "how ours differs from the others" to the TL;DR
Two-sided, honest comparison at the top of the TL;DR:
- Friendlier than several rivals (clean-cash on closure, deposit refund on
  non-fraud voids, no retroactive changes, soft dormancy, one consistent
  wagering number, short real restricted list)
- On par with the industry, not softer (sole-discretion powers, close without
  reason, no-KYC signup, no external regulator, standard caps, 35x at the
  tougher end)
Grounded in the captured competitor terms. Renders in HTML (2-col, stacks on
mobile) and the .docx.

Co-Authored-By: claude-flow <ruv@ruv.net>
</commit_message>
<xml_diff>
--- a/goluna-demo/GoLuna-Terms-and-Conditions.docx
+++ b/goluna-demo/GoLuna-Terms-and-Conditions.docx
@@ -3424,6 +3424,270 @@
           <w:szCs w:val="18"/>
         </w:rPr>
         <w:t xml:space="preserve">Plain-language summary of the points that matter most. For convenience only and not legally binding; the full Terms above govern.</w:t>
+      </w:r>
+    </w:p>
+    <w:p>
+      <w:pPr>
+        <w:spacing w:before="60" w:after="50"/>
+      </w:pPr>
+      <w:r>
+        <w:rPr>
+          <w:b/>
+          <w:bCs/>
+          <w:color w:val="0B5394"/>
+          <w:sz w:val="20"/>
+          <w:szCs w:val="20"/>
+        </w:rPr>
+        <w:t xml:space="preserve">How ours differs from the other operators</w:t>
+      </w:r>
+    </w:p>
+    <w:p>
+      <w:pPr>
+        <w:spacing w:after="40"/>
+      </w:pPr>
+      <w:r>
+        <w:rPr>
+          <w:b/>
+          <w:bCs/>
+          <w:color w:val="1F7A4D"/>
+          <w:sz w:val="19"/>
+          <w:szCs w:val="19"/>
+        </w:rPr>
+        <w:t xml:space="preserve">Friendlier than several rivals:</w:t>
+      </w:r>
+    </w:p>
+    <w:p>
+      <w:pPr>
+        <w:pStyle w:val="ListParagraph"/>
+        <w:numPr>
+          <w:ilvl w:val="0"/>
+          <w:numId w:val="1"/>
+        </w:numPr>
+        <w:spacing w:after="30"/>
+      </w:pPr>
+      <w:r>
+        <w:rPr>
+          <w:sz w:val="19"/>
+          <w:szCs w:val="19"/>
+        </w:rPr>
+        <w:t xml:space="preserve">Voluntary closure returns your clean cash balance — Betplay and Betpanda forfeit the whole balance when an account is closed.</w:t>
+      </w:r>
+    </w:p>
+    <w:p>
+      <w:pPr>
+        <w:pStyle w:val="ListParagraph"/>
+        <w:numPr>
+          <w:ilvl w:val="0"/>
+          <w:numId w:val="1"/>
+        </w:numPr>
+        <w:spacing w:after="30"/>
+      </w:pPr>
+      <w:r>
+        <w:rPr>
+          <w:sz w:val="19"/>
+          <w:szCs w:val="19"/>
+        </w:rPr>
+        <w:t xml:space="preserve">A non-fraud bonus void refunds your deposit (only the winnings are voided) rather than confiscating everything.</w:t>
+      </w:r>
+    </w:p>
+    <w:p>
+      <w:pPr>
+        <w:pStyle w:val="ListParagraph"/>
+        <w:numPr>
+          <w:ilvl w:val="0"/>
+          <w:numId w:val="1"/>
+        </w:numPr>
+        <w:spacing w:after="30"/>
+      </w:pPr>
+      <w:r>
+        <w:rPr>
+          <w:sz w:val="19"/>
+          <w:szCs w:val="19"/>
+        </w:rPr>
+        <w:t xml:space="preserve">No retroactive rule changes — 21.com reserves the right to restrict games and void winnings without notice; Coins says contribution rates “can change, contact support.”</w:t>
+      </w:r>
+    </w:p>
+    <w:p>
+      <w:pPr>
+        <w:pStyle w:val="ListParagraph"/>
+        <w:numPr>
+          <w:ilvl w:val="0"/>
+          <w:numId w:val="1"/>
+        </w:numPr>
+        <w:spacing w:after="30"/>
+      </w:pPr>
+      <w:r>
+        <w:rPr>
+          <w:sz w:val="19"/>
+          <w:szCs w:val="19"/>
+        </w:rPr>
+        <w:t xml:space="preserve">Soft dormancy: 12 months then free reactivation — Betplay deducts your balance after just 6 months.</w:t>
+      </w:r>
+    </w:p>
+    <w:p>
+      <w:pPr>
+        <w:pStyle w:val="ListParagraph"/>
+        <w:numPr>
+          <w:ilvl w:val="0"/>
+          <w:numId w:val="1"/>
+        </w:numPr>
+        <w:spacing w:after="30"/>
+      </w:pPr>
+      <w:r>
+        <w:rPr>
+          <w:sz w:val="19"/>
+          <w:szCs w:val="19"/>
+        </w:rPr>
+        <w:t xml:space="preserve">One consistent wagering figure throughout — Kings and Coins (same owner) quote three different numbers (x20 / x35 / 30x).</w:t>
+      </w:r>
+    </w:p>
+    <w:p>
+      <w:pPr>
+        <w:pStyle w:val="ListParagraph"/>
+        <w:numPr>
+          <w:ilvl w:val="0"/>
+          <w:numId w:val="1"/>
+        </w:numPr>
+        <w:spacing w:after="30"/>
+      </w:pPr>
+      <w:r>
+        <w:rPr>
+          <w:sz w:val="19"/>
+          <w:szCs w:val="19"/>
+        </w:rPr>
+        <w:t xml:space="preserve">A short, real restricted-country list — not Betpanda's ~70-country list (which even bans its own home country) or Kings' none at all.</w:t>
+      </w:r>
+    </w:p>
+    <w:p>
+      <w:pPr>
+        <w:spacing w:before="70" w:after="40"/>
+      </w:pPr>
+      <w:r>
+        <w:rPr>
+          <w:b/>
+          <w:bCs/>
+          <w:color w:val="B7791F"/>
+          <w:sz w:val="19"/>
+          <w:szCs w:val="19"/>
+        </w:rPr>
+        <w:t xml:space="preserve">On par with the industry — not softer:</w:t>
+      </w:r>
+    </w:p>
+    <w:p>
+      <w:pPr>
+        <w:pStyle w:val="ListParagraph"/>
+        <w:numPr>
+          <w:ilvl w:val="0"/>
+          <w:numId w:val="1"/>
+        </w:numPr>
+        <w:spacing w:after="30"/>
+      </w:pPr>
+      <w:r>
+        <w:rPr>
+          <w:sz w:val="19"/>
+          <w:szCs w:val="19"/>
+        </w:rPr>
+        <w:t xml:space="preserve">Sole / absolute discretion on fraud, abuse, bonus eligibility and account closure — same as all five.</w:t>
+      </w:r>
+    </w:p>
+    <w:p>
+      <w:pPr>
+        <w:pStyle w:val="ListParagraph"/>
+        <w:numPr>
+          <w:ilvl w:val="0"/>
+          <w:numId w:val="1"/>
+        </w:numPr>
+        <w:spacing w:after="30"/>
+      </w:pPr>
+      <w:r>
+        <w:rPr>
+          <w:sz w:val="19"/>
+          <w:szCs w:val="19"/>
+        </w:rPr>
+        <w:t xml:space="preserve">We can close an account without stating a reason (subject to law) — like Betpanda and Coins.</w:t>
+      </w:r>
+    </w:p>
+    <w:p>
+      <w:pPr>
+        <w:pStyle w:val="ListParagraph"/>
+        <w:numPr>
+          <w:ilvl w:val="0"/>
+          <w:numId w:val="1"/>
+        </w:numPr>
+        <w:spacing w:after="30"/>
+      </w:pPr>
+      <w:r>
+        <w:rPr>
+          <w:sz w:val="19"/>
+          <w:szCs w:val="19"/>
+        </w:rPr>
+        <w:t xml:space="preserve">No-KYC signup with KYC on trigger — like Betplay and Betpanda.</w:t>
+      </w:r>
+    </w:p>
+    <w:p>
+      <w:pPr>
+        <w:pStyle w:val="ListParagraph"/>
+        <w:numPr>
+          <w:ilvl w:val="0"/>
+          <w:numId w:val="1"/>
+        </w:numPr>
+        <w:spacing w:after="30"/>
+      </w:pPr>
+      <w:r>
+        <w:rPr>
+          <w:sz w:val="19"/>
+          <w:szCs w:val="19"/>
+        </w:rPr>
+        <w:t xml:space="preserve">No external gambling regulator; our decision is final — the standard unlicensed Costa Rica posture.</w:t>
+      </w:r>
+    </w:p>
+    <w:p>
+      <w:pPr>
+        <w:pStyle w:val="ListParagraph"/>
+        <w:numPr>
+          <w:ilvl w:val="0"/>
+          <w:numId w:val="1"/>
+        </w:numPr>
+        <w:spacing w:after="30"/>
+      </w:pPr>
+      <w:r>
+        <w:rPr>
+          <w:sz w:val="19"/>
+          <w:szCs w:val="19"/>
+        </w:rPr>
+        <w:t xml:space="preserve">Velocity caps, win caps and 1x deposit wagering — standard across the set.</w:t>
+      </w:r>
+    </w:p>
+    <w:p>
+      <w:pPr>
+        <w:pStyle w:val="ListParagraph"/>
+        <w:numPr>
+          <w:ilvl w:val="0"/>
+          <w:numId w:val="1"/>
+        </w:numPr>
+        <w:spacing w:after="30"/>
+      </w:pPr>
+      <w:r>
+        <w:rPr>
+          <w:sz w:val="19"/>
+          <w:szCs w:val="19"/>
+        </w:rPr>
+        <w:t xml:space="preserve">If deposit-match bonuses launch, the 35x wagering sits at the higher (tougher) end of the pack.</w:t>
+      </w:r>
+    </w:p>
+    <w:p>
+      <w:pPr>
+        <w:spacing w:before="90" w:after="40"/>
+      </w:pPr>
+      <w:r>
+        <w:rPr>
+          <w:b/>
+          <w:bCs/>
+          <w:color w:val="0B5394"/>
+          <w:sz w:val="20"/>
+          <w:szCs w:val="20"/>
+        </w:rPr>
+        <w:t xml:space="preserve">Key points by category</w:t>
       </w:r>
     </w:p>
     <w:p>

</xml_diff>

<commit_message>
tc-final: accuracy fixes to the ours-vs-others comparison
Verified every comparison claim against the captured competitor terms; fixed 3:
- "velocity/win caps standard across the set" was false (only Betplay/Betpanda
  have them) -> "matching the Costa-Rica pair GoLuna shares its platform with"
- "non-fraud void refunds your deposit" overstated our own discretionary §13.4
  -> "clean deposit may be refunded"
- "one consistent wagering figure" was imprecise -> "no internal contradictions"
Confirmed accurate as-is: Betpanda's 71-country list incl. its own Costa Rica;
Kings has no list; 25x/30x/15x/x35-vs-x20 figures; 6-month deduction; closure
forfeiture.

Co-Authored-By: claude-flow <ruv@ruv.net>
</commit_message>
<xml_diff>
--- a/goluna-demo/GoLuna-Terms-and-Conditions.docx
+++ b/goluna-demo/GoLuna-Terms-and-Conditions.docx
@@ -3487,7 +3487,7 @@
           <w:sz w:val="19"/>
           <w:szCs w:val="19"/>
         </w:rPr>
-        <w:t xml:space="preserve">A non-fraud bonus void refunds your deposit (only the winnings are voided) rather than confiscating everything.</w:t>
+        <w:t xml:space="preserve">A non-fraud bonus void takes only the winnings — your clean deposit may be refunded — not the all-funds confiscation Betplay and Kings apply.</w:t>
       </w:r>
     </w:p>
     <w:p>
@@ -3538,7 +3538,7 @@
           <w:sz w:val="19"/>
           <w:szCs w:val="19"/>
         </w:rPr>
-        <w:t xml:space="preserve">One consistent wagering figure throughout — Kings and Coins (same owner) quote three different numbers (x20 / x35 / 30x).</w:t>
+        <w:t xml:space="preserve">Consistent wagering numbers with no internal contradictions — Kings and Coins (same owner) quote three conflicting figures (x20 / x35 / 30x).</w:t>
       </w:r>
     </w:p>
     <w:p>
@@ -3655,7 +3655,7 @@
           <w:sz w:val="19"/>
           <w:szCs w:val="19"/>
         </w:rPr>
-        <w:t xml:space="preserve">Velocity caps, win caps and 1x deposit wagering — standard across the set.</w:t>
+        <w:t xml:space="preserve">Velocity caps, win caps and 1x deposit wagering — matching the Costa-Rica pair (Betplay &amp; Betpanda) GoLuna shares its platform with.</w:t>
       </w:r>
     </w:p>
     <w:p>

</xml_diff>